<commit_message>
feat(tracking): implement live tracking portal, national encomienda dispatch engine, and sync all diagrams and docs
</commit_message>
<xml_diff>
--- a/docs/02_Requerimientos.docx
+++ b/docs/02_Requerimientos.docx
@@ -141,7 +141,7 @@
           <w:color w:val="1E293B"/>
           <w:sz w:val="22"/>
         </w:rPr>
-        <w:t>Sistema de Gestión de Pedidos e Inventario de LeoFit</w:t>
+        <w:t>Sistema de Gestión de Pedidos, Envíos e Inventario de LeoFit</w:t>
       </w:r>
       <w:r>
         <w:rPr>
@@ -211,7 +211,7 @@
           <w:color w:val="1E293B"/>
           <w:sz w:val="22"/>
         </w:rPr>
-        <w:t xml:space="preserve"> que automatiza la captura, validación, registro, costeo y seguimiento de pedidos de indumentaria deportiva, proporcionando sincronización en tiempo real con el inventario y permitiendo la administración operativa desde cualquier dispositivo móvil o de escritorio.</w:t>
+        <w:t xml:space="preserve"> que automatiza la captura, validación, registro, costeo, despacho y seguimiento de pedidos de indumentaria deportiva, proporcionando sincronización en tiempo real con el inventario, control de fletes locales e interprovinciales (agencias de encomienda) y un portal de rastreo en vivo para clientes.</w:t>
       </w:r>
     </w:p>
     <w:p>
@@ -286,6 +286,20 @@
           <w:sz w:val="21"/>
         </w:rPr>
         <w:t>Proporcionar trazabilidad total del ciclo de vida de la orden a través de 5 estados operativos normalizados.</w:t>
+      </w:r>
+    </w:p>
+    <w:p>
+      <w:pPr>
+        <w:pStyle w:val="ListBullet"/>
+        <w:spacing w:before="20" w:after="40" w:line="276" w:lineRule="auto"/>
+      </w:pPr>
+      <w:r>
+        <w:rPr>
+          <w:rFonts w:ascii="Calibri" w:hAnsi="Calibri"/>
+          <w:color w:val="1E293B"/>
+          <w:sz w:val="21"/>
+        </w:rPr>
+        <w:t>Diferenciar la logística local directa (Lima Capital) del despacho nacional por encomienda (Shalom, Olva Courier, Marvisur).</w:t>
       </w:r>
     </w:p>
     <w:p>
@@ -366,7 +380,7 @@
           <w:color w:val="1E293B"/>
           <w:sz w:val="21"/>
         </w:rPr>
-        <w:t xml:space="preserve"> Usuario final sin formación técnica especializada que navega por el catálogo, selecciona artículos y formaliza órdenes de compra.</w:t>
+        <w:t xml:space="preserve"> Usuario final sin formación técnica especializada que navega por el catálogo, selecciona artículos, formaliza órdenes y rastrea su pedido en el portal en vivo.</w:t>
       </w:r>
     </w:p>
     <w:p>
@@ -389,7 +403,7 @@
           <w:color w:val="1E293B"/>
           <w:sz w:val="21"/>
         </w:rPr>
-        <w:t xml:space="preserve"> Responsable de la gestión de existencias, actualización de precios, cambio de estados de pedidos y visualización de métricas en el panel.</w:t>
+        <w:t xml:space="preserve"> Responsable de la gestión de existencias, actualización de precios, cambio de estados de pedidos, despacho local en Lima y consignación a agencias de encomienda en provincias.</w:t>
       </w:r>
     </w:p>
     <w:p>
@@ -511,7 +525,24 @@
           <w:color w:val="1E293B"/>
           <w:sz w:val="21"/>
         </w:rPr>
-        <w:t>Compatibilidad multi-navegador en Google Chrome, Microsoft Edge, Mozilla Firefox y Safari Mobile.</w:t>
+        <w:t xml:space="preserve">Cumplimiento de accesibilidad WCAG 2.1 AA/AAA con tipografía legible </w:t>
+      </w:r>
+      <w:r>
+        <w:rPr>
+          <w:rFonts w:ascii="Calibri" w:hAnsi="Calibri"/>
+          <w:i/>
+          <w:color w:val="1E293B"/>
+          <w:sz w:val="21"/>
+        </w:rPr>
+        <w:t>Plus Jakarta Sans</w:t>
+      </w:r>
+      <w:r>
+        <w:rPr>
+          <w:rFonts w:ascii="Calibri" w:hAnsi="Calibri"/>
+          <w:color w:val="1E293B"/>
+          <w:sz w:val="21"/>
+        </w:rPr>
+        <w:t xml:space="preserve"> y modo accesible conmutador.</w:t>
       </w:r>
     </w:p>
     <w:p>
@@ -526,7 +557,7 @@
           <w:color w:val="F97316"/>
           <w:sz w:val="28"/>
         </w:rPr>
-        <w:t>3. MATRIZ DE REQUISITOS FUNCIONALES (RF-001 A RF-012)</w:t>
+        <w:t>3. MATRIZ DE REQUISITOS FUNCIONALES (RF-001 A RF-014)</w:t>
       </w:r>
     </w:p>
     <w:tbl>
@@ -1711,7 +1742,7 @@
                 <w:color w:val="1E293B"/>
                 <w:sz w:val="19"/>
               </w:rPr>
-              <w:t>El sistema debe capturar los datos de entrega: nombre completo, teléfono móvil, dirección de envío y método de pago.</w:t>
+              <w:t>El sistema debe capturar los datos de entrega: nombre completo, teléfono móvil, dirección de envío y canal de atención.</w:t>
             </w:r>
           </w:p>
         </w:tc>
@@ -1771,7 +1802,7 @@
                 <w:color w:val="C2410C"/>
                 <w:sz w:val="19"/>
               </w:rPr>
-              <w:t>PED-2026-XXXX</w:t>
+              <w:t>LFT-XXX</w:t>
             </w:r>
             <w:r>
               <w:rPr>
@@ -1937,7 +1968,7 @@
                 <w:color w:val="1E293B"/>
                 <w:sz w:val="19"/>
               </w:rPr>
-              <w:t>El sistema debe calcular el costo de despacho según la zona geográfica seleccionada y consolidar el monto total a pagar.</w:t>
+              <w:t>El sistema debe calcular el costo de despacho según la zona geográfica (Lima local vs Provincia) y consolidar el total.</w:t>
             </w:r>
           </w:p>
         </w:tc>
@@ -1987,7 +2018,7 @@
                 <w:color w:val="1E293B"/>
                 <w:sz w:val="19"/>
               </w:rPr>
-              <w:t>Desglose aritmético exacto de subtotal de prendas, tarifa de flete y total de la orden.</w:t>
+              <w:t>Desglose aritmético exacto de subtotal de prendas, tarifa de delivery/encomienda y total.</w:t>
             </w:r>
           </w:p>
         </w:tc>
@@ -2171,7 +2202,7 @@
                 <w:color w:val="C2410C"/>
                 <w:sz w:val="19"/>
               </w:rPr>
-              <w:t>En Preparación</w:t>
+              <w:t>Preparación</w:t>
             </w:r>
             <w:r>
               <w:rPr>
@@ -2187,7 +2218,7 @@
                 <w:color w:val="C2410C"/>
                 <w:sz w:val="19"/>
               </w:rPr>
-              <w:t>En Camino</w:t>
+              <w:t>Camino</w:t>
             </w:r>
             <w:r>
               <w:rPr>
@@ -2437,7 +2468,7 @@
                 <w:color w:val="1E293B"/>
                 <w:sz w:val="19"/>
               </w:rPr>
-              <w:t>El sistema debe presentar la lista consolidada de pedidos con filtros por estado, cliente, fecha y rango de importes.</w:t>
+              <w:t>El sistema debe presentar la lista consolidada de pedidos con filtros por estado, cliente, fecha y canal de venta.</w:t>
             </w:r>
           </w:p>
         </w:tc>
@@ -2857,7 +2888,7 @@
                 <w:color w:val="1E293B"/>
                 <w:sz w:val="19"/>
               </w:rPr>
-              <w:t>El sistema debe mostrar tarjetas métricas con total de pedidos del día, importe bruto recaudado y prendas en nivel crítico (</w:t>
+              <w:t>El sistema debe mostrar tarjetas métricas con ingresos totales, pedidos en riesgo (</w:t>
             </w:r>
             <w:r>
               <w:rPr>
@@ -2866,7 +2897,7 @@
                 <w:color w:val="1E293B"/>
                 <w:sz w:val="19"/>
               </w:rPr>
-              <w:t>&lt; 5</w:t>
+              <w:t>&gt;24 h</w:t>
             </w:r>
             <w:r>
               <w:rPr>
@@ -2874,7 +2905,7 @@
                 <w:color w:val="1E293B"/>
                 <w:sz w:val="19"/>
               </w:rPr>
-              <w:t xml:space="preserve"> unid).</w:t>
+              <w:t>), pedidos del día y pipeline.</w:t>
             </w:r>
           </w:p>
         </w:tc>
@@ -2924,7 +2955,7 @@
                 <w:color w:val="1E293B"/>
                 <w:sz w:val="19"/>
               </w:rPr>
-              <w:t>Cálculo reactivo de totales de la jornada sin sobrecarga en la memoria del navegador.</w:t>
+              <w:t>Cálculo reactivo de totales de la jornada y modo privacidad de cifras en Soles.</w:t>
             </w:r>
           </w:p>
         </w:tc>
@@ -3136,7 +3167,7 @@
                 <w:color w:val="1E293B"/>
                 <w:sz w:val="19"/>
               </w:rPr>
-              <w:t>Formato limpio con ID de pedido, detalle de ítems, flete, total y datos de contacto del cliente.</w:t>
+              <w:t>Formato limpio con ID de pedido, detalle de prendas, flete, total y datos de contacto.</w:t>
             </w:r>
           </w:p>
         </w:tc>
@@ -3344,7 +3375,23 @@
                 <w:color w:val="1E293B"/>
                 <w:sz w:val="19"/>
               </w:rPr>
-              <w:t>Validación segura de credenciales de administrador y persistencia de sesión controlada.</w:t>
+              <w:t>Validación segura de credenciales de administrador (</w:t>
+            </w:r>
+            <w:r>
+              <w:rPr>
+                <w:rFonts w:ascii="Consolas" w:hAnsi="Consolas"/>
+                <w:color w:val="C2410C"/>
+                <w:sz w:val="19"/>
+              </w:rPr>
+              <w:t>victor@leofit.com</w:t>
+            </w:r>
+            <w:r>
+              <w:rPr>
+                <w:rFonts w:ascii="Calibri" w:hAnsi="Calibri"/>
+                <w:color w:val="1E293B"/>
+                <w:sz w:val="19"/>
+              </w:rPr>
+              <w:t>) y auto-logout.</w:t>
             </w:r>
           </w:p>
         </w:tc>
@@ -3370,6 +3417,442 @@
                 <w:sz w:val="19"/>
               </w:rPr>
               <w:t>Seguridad</w:t>
+            </w:r>
+          </w:p>
+        </w:tc>
+        <w:tc>
+          <w:tcPr>
+            <w:tcW w:type="dxa" w:w="1170"/>
+            <w:vAlign w:val="center"/>
+            <w:tcMar>
+              <w:top w:w="120" w:type="dxa"/>
+              <w:bottom w:w="120" w:type="dxa"/>
+              <w:left w:w="150" w:type="dxa"/>
+              <w:right w:w="150" w:type="dxa"/>
+            </w:tcMar>
+          </w:tcPr>
+          <w:p>
+            <w:pPr>
+              <w:spacing w:before="0" w:after="0" w:line="276" w:lineRule="auto"/>
+            </w:pPr>
+            <w:r>
+              <w:rPr>
+                <w:rFonts w:ascii="Calibri" w:hAnsi="Calibri"/>
+                <w:color w:val="1E293B"/>
+                <w:sz w:val="19"/>
+              </w:rPr>
+              <w:t>Implementado</w:t>
+            </w:r>
+          </w:p>
+        </w:tc>
+      </w:tr>
+      <w:tr>
+        <w:trPr>
+          <w:trHeight w:val="280"/>
+        </w:trPr>
+        <w:tc>
+          <w:tcPr>
+            <w:tcW w:type="dxa" w:w="1170"/>
+            <w:vAlign w:val="center"/>
+            <w:tcMar>
+              <w:top w:w="120" w:type="dxa"/>
+              <w:bottom w:w="120" w:type="dxa"/>
+              <w:left w:w="150" w:type="dxa"/>
+              <w:right w:w="150" w:type="dxa"/>
+            </w:tcMar>
+            <w:shd w:fill="F8FAFC"/>
+          </w:tcPr>
+          <w:p>
+            <w:pPr>
+              <w:spacing w:before="0" w:after="0" w:line="276" w:lineRule="auto"/>
+            </w:pPr>
+            <w:r>
+              <w:rPr>
+                <w:rFonts w:ascii="Calibri" w:hAnsi="Calibri"/>
+                <w:b/>
+                <w:color w:val="1E293B"/>
+                <w:sz w:val="19"/>
+              </w:rPr>
+              <w:t>RF-013</w:t>
+            </w:r>
+          </w:p>
+        </w:tc>
+        <w:tc>
+          <w:tcPr>
+            <w:tcW w:type="dxa" w:w="1170"/>
+            <w:vAlign w:val="center"/>
+            <w:tcMar>
+              <w:top w:w="120" w:type="dxa"/>
+              <w:bottom w:w="120" w:type="dxa"/>
+              <w:left w:w="150" w:type="dxa"/>
+              <w:right w:w="150" w:type="dxa"/>
+            </w:tcMar>
+            <w:shd w:fill="F8FAFC"/>
+          </w:tcPr>
+          <w:p>
+            <w:pPr>
+              <w:spacing w:before="0" w:after="0" w:line="276" w:lineRule="auto"/>
+            </w:pPr>
+            <w:r>
+              <w:rPr>
+                <w:rFonts w:ascii="Calibri" w:hAnsi="Calibri"/>
+                <w:color w:val="1E293B"/>
+                <w:sz w:val="19"/>
+              </w:rPr>
+              <w:t>Gestión de Despacho Dual y Encomiendas</w:t>
+            </w:r>
+          </w:p>
+        </w:tc>
+        <w:tc>
+          <w:tcPr>
+            <w:tcW w:type="dxa" w:w="1170"/>
+            <w:vAlign w:val="center"/>
+            <w:tcMar>
+              <w:top w:w="120" w:type="dxa"/>
+              <w:bottom w:w="120" w:type="dxa"/>
+              <w:left w:w="150" w:type="dxa"/>
+              <w:right w:w="150" w:type="dxa"/>
+            </w:tcMar>
+            <w:shd w:fill="F8FAFC"/>
+          </w:tcPr>
+          <w:p>
+            <w:pPr>
+              <w:spacing w:before="0" w:after="0" w:line="276" w:lineRule="auto"/>
+            </w:pPr>
+            <w:r>
+              <w:rPr>
+                <w:rFonts w:ascii="Calibri" w:hAnsi="Calibri"/>
+                <w:color w:val="1E293B"/>
+                <w:sz w:val="19"/>
+              </w:rPr>
+              <w:t>Administrador</w:t>
+            </w:r>
+          </w:p>
+        </w:tc>
+        <w:tc>
+          <w:tcPr>
+            <w:tcW w:type="dxa" w:w="1170"/>
+            <w:vAlign w:val="center"/>
+            <w:tcMar>
+              <w:top w:w="120" w:type="dxa"/>
+              <w:bottom w:w="120" w:type="dxa"/>
+              <w:left w:w="150" w:type="dxa"/>
+              <w:right w:w="150" w:type="dxa"/>
+            </w:tcMar>
+            <w:shd w:fill="F8FAFC"/>
+          </w:tcPr>
+          <w:p>
+            <w:pPr>
+              <w:spacing w:before="0" w:after="0" w:line="276" w:lineRule="auto"/>
+            </w:pPr>
+            <w:r>
+              <w:rPr>
+                <w:rFonts w:ascii="Calibri" w:hAnsi="Calibri"/>
+                <w:color w:val="1E293B"/>
+                <w:sz w:val="19"/>
+              </w:rPr>
+              <w:t>El sistema debe discriminar entre entrega local en Lima y envío nacional por agencias de encomienda (Shalom, Olva, Marvisur).</w:t>
+            </w:r>
+          </w:p>
+        </w:tc>
+        <w:tc>
+          <w:tcPr>
+            <w:tcW w:type="dxa" w:w="1170"/>
+            <w:vAlign w:val="center"/>
+            <w:tcMar>
+              <w:top w:w="120" w:type="dxa"/>
+              <w:bottom w:w="120" w:type="dxa"/>
+              <w:left w:w="150" w:type="dxa"/>
+              <w:right w:w="150" w:type="dxa"/>
+            </w:tcMar>
+            <w:shd w:fill="F8FAFC"/>
+          </w:tcPr>
+          <w:p>
+            <w:pPr>
+              <w:spacing w:before="0" w:after="0" w:line="276" w:lineRule="auto"/>
+            </w:pPr>
+            <w:r>
+              <w:rPr>
+                <w:rFonts w:ascii="Calibri" w:hAnsi="Calibri"/>
+                <w:color w:val="1E293B"/>
+                <w:sz w:val="19"/>
+              </w:rPr>
+              <w:t>Alta</w:t>
+            </w:r>
+          </w:p>
+        </w:tc>
+        <w:tc>
+          <w:tcPr>
+            <w:tcW w:type="dxa" w:w="1170"/>
+            <w:vAlign w:val="center"/>
+            <w:tcMar>
+              <w:top w:w="120" w:type="dxa"/>
+              <w:bottom w:w="120" w:type="dxa"/>
+              <w:left w:w="150" w:type="dxa"/>
+              <w:right w:w="150" w:type="dxa"/>
+            </w:tcMar>
+            <w:shd w:fill="F8FAFC"/>
+          </w:tcPr>
+          <w:p>
+            <w:pPr>
+              <w:spacing w:before="0" w:after="0" w:line="276" w:lineRule="auto"/>
+            </w:pPr>
+            <w:r>
+              <w:rPr>
+                <w:rFonts w:ascii="Calibri" w:hAnsi="Calibri"/>
+                <w:color w:val="1E293B"/>
+                <w:sz w:val="19"/>
+              </w:rPr>
+              <w:t>Registro de ciudad de destino, agencia de encomienda y N° de Guía de Remisión/Clave.</w:t>
+            </w:r>
+          </w:p>
+        </w:tc>
+        <w:tc>
+          <w:tcPr>
+            <w:tcW w:type="dxa" w:w="1170"/>
+            <w:vAlign w:val="center"/>
+            <w:tcMar>
+              <w:top w:w="120" w:type="dxa"/>
+              <w:bottom w:w="120" w:type="dxa"/>
+              <w:left w:w="150" w:type="dxa"/>
+              <w:right w:w="150" w:type="dxa"/>
+            </w:tcMar>
+            <w:shd w:fill="F8FAFC"/>
+          </w:tcPr>
+          <w:p>
+            <w:pPr>
+              <w:spacing w:before="0" w:after="0" w:line="276" w:lineRule="auto"/>
+            </w:pPr>
+            <w:r>
+              <w:rPr>
+                <w:rFonts w:ascii="Calibri" w:hAnsi="Calibri"/>
+                <w:color w:val="1E293B"/>
+                <w:sz w:val="19"/>
+              </w:rPr>
+              <w:t>Logística</w:t>
+            </w:r>
+          </w:p>
+        </w:tc>
+        <w:tc>
+          <w:tcPr>
+            <w:tcW w:type="dxa" w:w="1170"/>
+            <w:vAlign w:val="center"/>
+            <w:tcMar>
+              <w:top w:w="120" w:type="dxa"/>
+              <w:bottom w:w="120" w:type="dxa"/>
+              <w:left w:w="150" w:type="dxa"/>
+              <w:right w:w="150" w:type="dxa"/>
+            </w:tcMar>
+            <w:shd w:fill="F8FAFC"/>
+          </w:tcPr>
+          <w:p>
+            <w:pPr>
+              <w:spacing w:before="0" w:after="0" w:line="276" w:lineRule="auto"/>
+            </w:pPr>
+            <w:r>
+              <w:rPr>
+                <w:rFonts w:ascii="Calibri" w:hAnsi="Calibri"/>
+                <w:color w:val="1E293B"/>
+                <w:sz w:val="19"/>
+              </w:rPr>
+              <w:t>Implementado</w:t>
+            </w:r>
+          </w:p>
+        </w:tc>
+      </w:tr>
+      <w:tr>
+        <w:trPr>
+          <w:trHeight w:val="280"/>
+        </w:trPr>
+        <w:tc>
+          <w:tcPr>
+            <w:tcW w:type="dxa" w:w="1170"/>
+            <w:vAlign w:val="center"/>
+            <w:tcMar>
+              <w:top w:w="120" w:type="dxa"/>
+              <w:bottom w:w="120" w:type="dxa"/>
+              <w:left w:w="150" w:type="dxa"/>
+              <w:right w:w="150" w:type="dxa"/>
+            </w:tcMar>
+          </w:tcPr>
+          <w:p>
+            <w:pPr>
+              <w:spacing w:before="0" w:after="0" w:line="276" w:lineRule="auto"/>
+            </w:pPr>
+            <w:r>
+              <w:rPr>
+                <w:rFonts w:ascii="Calibri" w:hAnsi="Calibri"/>
+                <w:b/>
+                <w:color w:val="1E293B"/>
+                <w:sz w:val="19"/>
+              </w:rPr>
+              <w:t>RF-014</w:t>
+            </w:r>
+          </w:p>
+        </w:tc>
+        <w:tc>
+          <w:tcPr>
+            <w:tcW w:type="dxa" w:w="1170"/>
+            <w:vAlign w:val="center"/>
+            <w:tcMar>
+              <w:top w:w="120" w:type="dxa"/>
+              <w:bottom w:w="120" w:type="dxa"/>
+              <w:left w:w="150" w:type="dxa"/>
+              <w:right w:w="150" w:type="dxa"/>
+            </w:tcMar>
+          </w:tcPr>
+          <w:p>
+            <w:pPr>
+              <w:spacing w:before="0" w:after="0" w:line="276" w:lineRule="auto"/>
+            </w:pPr>
+            <w:r>
+              <w:rPr>
+                <w:rFonts w:ascii="Calibri" w:hAnsi="Calibri"/>
+                <w:color w:val="1E293B"/>
+                <w:sz w:val="19"/>
+              </w:rPr>
+              <w:t>Portal de Rastreo de Envíos en Vivo</w:t>
+            </w:r>
+          </w:p>
+        </w:tc>
+        <w:tc>
+          <w:tcPr>
+            <w:tcW w:type="dxa" w:w="1170"/>
+            <w:vAlign w:val="center"/>
+            <w:tcMar>
+              <w:top w:w="120" w:type="dxa"/>
+              <w:bottom w:w="120" w:type="dxa"/>
+              <w:left w:w="150" w:type="dxa"/>
+              <w:right w:w="150" w:type="dxa"/>
+            </w:tcMar>
+          </w:tcPr>
+          <w:p>
+            <w:pPr>
+              <w:spacing w:before="0" w:after="0" w:line="276" w:lineRule="auto"/>
+            </w:pPr>
+            <w:r>
+              <w:rPr>
+                <w:rFonts w:ascii="Calibri" w:hAnsi="Calibri"/>
+                <w:color w:val="1E293B"/>
+                <w:sz w:val="19"/>
+              </w:rPr>
+              <w:t>Cliente / Admin</w:t>
+            </w:r>
+          </w:p>
+        </w:tc>
+        <w:tc>
+          <w:tcPr>
+            <w:tcW w:type="dxa" w:w="1170"/>
+            <w:vAlign w:val="center"/>
+            <w:tcMar>
+              <w:top w:w="120" w:type="dxa"/>
+              <w:bottom w:w="120" w:type="dxa"/>
+              <w:left w:w="150" w:type="dxa"/>
+              <w:right w:w="150" w:type="dxa"/>
+            </w:tcMar>
+          </w:tcPr>
+          <w:p>
+            <w:pPr>
+              <w:spacing w:before="0" w:after="0" w:line="276" w:lineRule="auto"/>
+            </w:pPr>
+            <w:r>
+              <w:rPr>
+                <w:rFonts w:ascii="Calibri" w:hAnsi="Calibri"/>
+                <w:color w:val="1E293B"/>
+                <w:sz w:val="19"/>
+              </w:rPr>
+              <w:t xml:space="preserve">El sistema debe ofrecer un portal de autoservicio donde el cliente consulta el timeline en vivo de su paquete con su código </w:t>
+            </w:r>
+            <w:r>
+              <w:rPr>
+                <w:rFonts w:ascii="Consolas" w:hAnsi="Consolas"/>
+                <w:color w:val="C2410C"/>
+                <w:sz w:val="19"/>
+              </w:rPr>
+              <w:t>LFT-XXX</w:t>
+            </w:r>
+            <w:r>
+              <w:rPr>
+                <w:rFonts w:ascii="Calibri" w:hAnsi="Calibri"/>
+                <w:color w:val="1E293B"/>
+                <w:sz w:val="19"/>
+              </w:rPr>
+              <w:t>.</w:t>
+            </w:r>
+          </w:p>
+        </w:tc>
+        <w:tc>
+          <w:tcPr>
+            <w:tcW w:type="dxa" w:w="1170"/>
+            <w:vAlign w:val="center"/>
+            <w:tcMar>
+              <w:top w:w="120" w:type="dxa"/>
+              <w:bottom w:w="120" w:type="dxa"/>
+              <w:left w:w="150" w:type="dxa"/>
+              <w:right w:w="150" w:type="dxa"/>
+            </w:tcMar>
+          </w:tcPr>
+          <w:p>
+            <w:pPr>
+              <w:spacing w:before="0" w:after="0" w:line="276" w:lineRule="auto"/>
+            </w:pPr>
+            <w:r>
+              <w:rPr>
+                <w:rFonts w:ascii="Calibri" w:hAnsi="Calibri"/>
+                <w:color w:val="1E293B"/>
+                <w:sz w:val="19"/>
+              </w:rPr>
+              <w:t>Alta</w:t>
+            </w:r>
+          </w:p>
+        </w:tc>
+        <w:tc>
+          <w:tcPr>
+            <w:tcW w:type="dxa" w:w="1170"/>
+            <w:vAlign w:val="center"/>
+            <w:tcMar>
+              <w:top w:w="120" w:type="dxa"/>
+              <w:bottom w:w="120" w:type="dxa"/>
+              <w:left w:w="150" w:type="dxa"/>
+              <w:right w:w="150" w:type="dxa"/>
+            </w:tcMar>
+          </w:tcPr>
+          <w:p>
+            <w:pPr>
+              <w:spacing w:before="0" w:after="0" w:line="276" w:lineRule="auto"/>
+            </w:pPr>
+            <w:r>
+              <w:rPr>
+                <w:rFonts w:ascii="Calibri" w:hAnsi="Calibri"/>
+                <w:color w:val="1E293B"/>
+                <w:sz w:val="19"/>
+              </w:rPr>
+              <w:t>Búsqueda reactiva, timeline de 4 hitos, datos de agencia/guía y enlace directo a soporte WhatsApp.</w:t>
+            </w:r>
+          </w:p>
+        </w:tc>
+        <w:tc>
+          <w:tcPr>
+            <w:tcW w:type="dxa" w:w="1170"/>
+            <w:vAlign w:val="center"/>
+            <w:tcMar>
+              <w:top w:w="120" w:type="dxa"/>
+              <w:bottom w:w="120" w:type="dxa"/>
+              <w:left w:w="150" w:type="dxa"/>
+              <w:right w:w="150" w:type="dxa"/>
+            </w:tcMar>
+          </w:tcPr>
+          <w:p>
+            <w:pPr>
+              <w:spacing w:before="0" w:after="0" w:line="276" w:lineRule="auto"/>
+            </w:pPr>
+            <w:r>
+              <w:rPr>
+                <w:rFonts w:ascii="Calibri" w:hAnsi="Calibri"/>
+                <w:color w:val="1E293B"/>
+                <w:sz w:val="19"/>
+              </w:rPr>
+              <w:t>Tracking</w:t>
             </w:r>
           </w:p>
         </w:tc>
@@ -3736,7 +4219,7 @@
                 <w:color w:val="1E293B"/>
                 <w:sz w:val="19"/>
               </w:rPr>
-              <w:t>Diseño Mobile-First</w:t>
+              <w:t>Diseño Mobile-First &amp; A11y</w:t>
             </w:r>
           </w:p>
         </w:tc>
@@ -3762,7 +4245,23 @@
                 <w:color w:val="1E293B"/>
                 <w:sz w:val="19"/>
               </w:rPr>
-              <w:t>La interfaz debe ser altamente intuitiva y ergonómica en pantallas táctiles de smartphones.</w:t>
+              <w:t xml:space="preserve">La interfaz debe ser altamente intuitiva y ergonómica en pantallas táctiles con modo accesible </w:t>
+            </w:r>
+            <w:r>
+              <w:rPr>
+                <w:rFonts w:ascii="Consolas" w:hAnsi="Consolas"/>
+                <w:color w:val="C2410C"/>
+                <w:sz w:val="19"/>
+              </w:rPr>
+              <w:t>[A+ / A++]</w:t>
+            </w:r>
+            <w:r>
+              <w:rPr>
+                <w:rFonts w:ascii="Calibri" w:hAnsi="Calibri"/>
+                <w:color w:val="1E293B"/>
+                <w:sz w:val="19"/>
+              </w:rPr>
+              <w:t>.</w:t>
             </w:r>
           </w:p>
         </w:tc>
@@ -3805,7 +4304,7 @@
                 <w:color w:val="1E293B"/>
                 <w:sz w:val="19"/>
               </w:rPr>
-              <w:t xml:space="preserve"> minutos por usuarios no técnicos.</w:t>
+              <w:t xml:space="preserve"> minutos por adultos o personas con baja visión.</w:t>
             </w:r>
           </w:p>
         </w:tc>
@@ -5140,7 +5639,23 @@
                 <w:color w:val="1E293B"/>
                 <w:sz w:val="19"/>
               </w:rPr>
-              <w:t>Toda orden debe conservar su historial y no puede ser eliminada físicamente sin registro.</w:t>
+              <w:t xml:space="preserve">Toda orden debe conservar su historial y correlativo único </w:t>
+            </w:r>
+            <w:r>
+              <w:rPr>
+                <w:rFonts w:ascii="Consolas" w:hAnsi="Consolas"/>
+                <w:color w:val="C2410C"/>
+                <w:sz w:val="19"/>
+              </w:rPr>
+              <w:t>LFT-XXX</w:t>
+            </w:r>
+            <w:r>
+              <w:rPr>
+                <w:rFonts w:ascii="Calibri" w:hAnsi="Calibri"/>
+                <w:color w:val="1E293B"/>
+                <w:sz w:val="19"/>
+              </w:rPr>
+              <w:t>.</w:t>
             </w:r>
           </w:p>
         </w:tc>
@@ -5166,7 +5681,7 @@
                 <w:color w:val="1E293B"/>
                 <w:sz w:val="19"/>
               </w:rPr>
-              <w:t>Cada orden almacena identificador correlativo, fecha, hora y estado actual.</w:t>
+              <w:t>Cada orden almacena identificador correlativo, fecha, flete, guía y estado actual.</w:t>
             </w:r>
           </w:p>
         </w:tc>
@@ -5325,7 +5840,7 @@
                 <w:color w:val="1E293B"/>
                 <w:sz w:val="19"/>
               </w:rPr>
-              <w:t>Rutas Protegidas</w:t>
+              <w:t>Rutas Protegidas y Privacidad</w:t>
             </w:r>
           </w:p>
         </w:tc>
@@ -5350,7 +5865,7 @@
                 <w:color w:val="1E293B"/>
                 <w:sz w:val="19"/>
               </w:rPr>
-              <w:t>Las opciones de edición de existencias deben estar restringidas a sesiones autenticadas.</w:t>
+              <w:t>Las opciones de edición y cifras monetarias pueden ocultarse con un clic.</w:t>
             </w:r>
           </w:p>
         </w:tc>
@@ -5375,7 +5890,7 @@
                 <w:color w:val="1E293B"/>
                 <w:sz w:val="19"/>
               </w:rPr>
-              <w:t>Denegación inmediata de acceso ante solicitudes no autorizadas.</w:t>
+              <w:t>Denegación inmediata de acceso sin sesión y modo privacidad activable.</w:t>
             </w:r>
           </w:p>
         </w:tc>
@@ -5828,7 +6343,7 @@
                 <w:color w:val="1E293B"/>
                 <w:sz w:val="19"/>
               </w:rPr>
-              <w:t xml:space="preserve">Cumplimiento estricto de directrices WCAG 2.1 nivel AA (contraste </w:t>
+              <w:t xml:space="preserve">Cumplimiento estricto de directrices WCAG 2.1 nivel AAA/AA (contraste </w:t>
             </w:r>
             <w:r>
               <w:rPr>
@@ -5837,7 +6352,7 @@
                 <w:color w:val="1E293B"/>
                 <w:sz w:val="19"/>
               </w:rPr>
-              <w:t>≥ 4.5:1</w:t>
+              <w:t>≥ 7:1</w:t>
             </w:r>
             <w:r>
               <w:rPr>
@@ -5870,7 +6385,7 @@
                 <w:color w:val="1E293B"/>
                 <w:sz w:val="19"/>
               </w:rPr>
-              <w:t>Media</w:t>
+              <w:t>Alta</w:t>
             </w:r>
           </w:p>
         </w:tc>
@@ -5895,7 +6410,7 @@
                 <w:color w:val="1E293B"/>
                 <w:sz w:val="19"/>
               </w:rPr>
-              <w:t>Auditoría con extensión Axe y Lighthouse Accessibility.</w:t>
+              <w:t>Auditoría con tipografía Plus Jakarta Sans y Axe DevTools.</w:t>
             </w:r>
           </w:p>
         </w:tc>
@@ -6314,7 +6829,7 @@
                 <w:color w:val="1E293B"/>
                 <w:sz w:val="19"/>
               </w:rPr>
-              <w:t>RF-005, RF-006, RF-011</w:t>
+              <w:t>RF-005, RF-006, RF-011, RF-013</w:t>
             </w:r>
           </w:p>
         </w:tc>
@@ -6340,7 +6855,7 @@
                 <w:color w:val="1E293B"/>
                 <w:sz w:val="19"/>
               </w:rPr>
-              <w:t>HU-003 (Registro de Pedidos)</w:t>
+              <w:t>HU-003 (Registro y Despacho de Pedidos)</w:t>
             </w:r>
           </w:p>
         </w:tc>
@@ -6423,7 +6938,7 @@
                 <w:color w:val="1E293B"/>
                 <w:sz w:val="19"/>
               </w:rPr>
-              <w:t>RF-007, RF-008</w:t>
+              <w:t>RF-007, RF-008, RF-013</w:t>
             </w:r>
           </w:p>
         </w:tc>
@@ -6448,7 +6963,7 @@
                 <w:color w:val="1E293B"/>
                 <w:sz w:val="19"/>
               </w:rPr>
-              <w:t>HU-004 (Control de Estados)</w:t>
+              <w:t>HU-004 (Control de Estados y Encomiendas)</w:t>
             </w:r>
           </w:p>
         </w:tc>
@@ -6829,6 +7344,112 @@
           </w:p>
         </w:tc>
       </w:tr>
+      <w:tr>
+        <w:trPr>
+          <w:trHeight w:val="280"/>
+        </w:trPr>
+        <w:tc>
+          <w:tcPr>
+            <w:tcW w:type="dxa" w:w="2340"/>
+            <w:vAlign w:val="center"/>
+            <w:tcMar>
+              <w:top w:w="120" w:type="dxa"/>
+              <w:bottom w:w="120" w:type="dxa"/>
+              <w:left w:w="150" w:type="dxa"/>
+              <w:right w:w="150" w:type="dxa"/>
+            </w:tcMar>
+          </w:tcPr>
+          <w:p>
+            <w:pPr>
+              <w:spacing w:before="0" w:after="0" w:line="276" w:lineRule="auto"/>
+            </w:pPr>
+            <w:r>
+              <w:rPr>
+                <w:rFonts w:ascii="Calibri" w:hAnsi="Calibri"/>
+                <w:b/>
+                <w:color w:val="1E293B"/>
+                <w:sz w:val="19"/>
+              </w:rPr>
+              <w:t>RF-014</w:t>
+            </w:r>
+          </w:p>
+        </w:tc>
+        <w:tc>
+          <w:tcPr>
+            <w:tcW w:type="dxa" w:w="2340"/>
+            <w:vAlign w:val="center"/>
+            <w:tcMar>
+              <w:top w:w="120" w:type="dxa"/>
+              <w:bottom w:w="120" w:type="dxa"/>
+              <w:left w:w="150" w:type="dxa"/>
+              <w:right w:w="150" w:type="dxa"/>
+            </w:tcMar>
+          </w:tcPr>
+          <w:p>
+            <w:pPr>
+              <w:spacing w:before="0" w:after="0" w:line="276" w:lineRule="auto"/>
+            </w:pPr>
+            <w:r>
+              <w:rPr>
+                <w:rFonts w:ascii="Calibri" w:hAnsi="Calibri"/>
+                <w:color w:val="1E293B"/>
+                <w:sz w:val="19"/>
+              </w:rPr>
+              <w:t>HU-008 (Portal de Rastreo en Vivo)</w:t>
+            </w:r>
+          </w:p>
+        </w:tc>
+        <w:tc>
+          <w:tcPr>
+            <w:tcW w:type="dxa" w:w="2340"/>
+            <w:vAlign w:val="center"/>
+            <w:tcMar>
+              <w:top w:w="120" w:type="dxa"/>
+              <w:bottom w:w="120" w:type="dxa"/>
+              <w:left w:w="150" w:type="dxa"/>
+              <w:right w:w="150" w:type="dxa"/>
+            </w:tcMar>
+          </w:tcPr>
+          <w:p>
+            <w:pPr>
+              <w:spacing w:before="0" w:after="0" w:line="276" w:lineRule="auto"/>
+            </w:pPr>
+            <w:r>
+              <w:rPr>
+                <w:rFonts w:ascii="Calibri" w:hAnsi="Calibri"/>
+                <w:color w:val="1E293B"/>
+                <w:sz w:val="19"/>
+              </w:rPr>
+              <w:t>EP-05</w:t>
+            </w:r>
+          </w:p>
+        </w:tc>
+        <w:tc>
+          <w:tcPr>
+            <w:tcW w:type="dxa" w:w="2340"/>
+            <w:vAlign w:val="center"/>
+            <w:tcMar>
+              <w:top w:w="120" w:type="dxa"/>
+              <w:bottom w:w="120" w:type="dxa"/>
+              <w:left w:w="150" w:type="dxa"/>
+              <w:right w:w="150" w:type="dxa"/>
+            </w:tcMar>
+          </w:tcPr>
+          <w:p>
+            <w:pPr>
+              <w:spacing w:before="0" w:after="0" w:line="276" w:lineRule="auto"/>
+            </w:pPr>
+            <w:r>
+              <w:rPr>
+                <w:rFonts w:ascii="Consolas" w:hAnsi="Consolas"/>
+                <w:color w:val="C2410C"/>
+                <w:sz w:val="19"/>
+              </w:rPr>
+              <w:t>src/pages/RastreoPublico.tsx</w:t>
+            </w:r>
+          </w:p>
+        </w:tc>
+      </w:tr>
     </w:tbl>
     <w:p>
       <w:pPr>

</xml_diff>

<commit_message>
feat(security): incorporate author and creator identity in codebase, package metadata, docstrings and UI profiles
</commit_message>
<xml_diff>
--- a/docs/02_Requerimientos.docx
+++ b/docs/02_Requerimientos.docx
@@ -557,7 +557,7 @@
           <w:color w:val="F97316"/>
           <w:sz w:val="28"/>
         </w:rPr>
-        <w:t>3. MATRIZ DE REQUISITOS FUNCIONALES (RF-001 A RF-014)</w:t>
+        <w:t>3. MATRIZ DE REQUISITOS FUNCIONALES (RF-001 A RF-017)</w:t>
       </w:r>
     </w:p>
     <w:tbl>
@@ -2955,7 +2955,7 @@
                 <w:color w:val="1E293B"/>
                 <w:sz w:val="19"/>
               </w:rPr>
-              <w:t>Cálculo reactivo de totales de la jornada y modo privacidad de cifras en Soles.</w:t>
+              <w:t>Cálculo reactivo de totales de la jornada y conmutador granular de privacidad de cifras en Soles.</w:t>
             </w:r>
           </w:p>
         </w:tc>
@@ -3777,7 +3777,7 @@
                 <w:color w:val="1E293B"/>
                 <w:sz w:val="19"/>
               </w:rPr>
-              <w:t>.</w:t>
+              <w:t>, DNI o teléfono.</w:t>
             </w:r>
           </w:p>
         </w:tc>
@@ -3827,7 +3827,7 @@
                 <w:color w:val="1E293B"/>
                 <w:sz w:val="19"/>
               </w:rPr>
-              <w:t>Búsqueda reactiva, timeline de 4 hitos, datos de agencia/guía y enlace directo a soporte WhatsApp.</w:t>
+              <w:t>Búsqueda reactiva, timeline de 4 hitos, datos de agencia/guía, desglose de flete y garantías.</w:t>
             </w:r>
           </w:p>
         </w:tc>
@@ -3866,6 +3866,705 @@
               <w:left w:w="150" w:type="dxa"/>
               <w:right w:w="150" w:type="dxa"/>
             </w:tcMar>
+          </w:tcPr>
+          <w:p>
+            <w:pPr>
+              <w:spacing w:before="0" w:after="0" w:line="276" w:lineRule="auto"/>
+            </w:pPr>
+            <w:r>
+              <w:rPr>
+                <w:rFonts w:ascii="Calibri" w:hAnsi="Calibri"/>
+                <w:color w:val="1E293B"/>
+                <w:sz w:val="19"/>
+              </w:rPr>
+              <w:t>Implementado</w:t>
+            </w:r>
+          </w:p>
+        </w:tc>
+      </w:tr>
+      <w:tr>
+        <w:trPr>
+          <w:trHeight w:val="280"/>
+        </w:trPr>
+        <w:tc>
+          <w:tcPr>
+            <w:tcW w:type="dxa" w:w="1170"/>
+            <w:vAlign w:val="center"/>
+            <w:tcMar>
+              <w:top w:w="120" w:type="dxa"/>
+              <w:bottom w:w="120" w:type="dxa"/>
+              <w:left w:w="150" w:type="dxa"/>
+              <w:right w:w="150" w:type="dxa"/>
+            </w:tcMar>
+            <w:shd w:fill="F8FAFC"/>
+          </w:tcPr>
+          <w:p>
+            <w:pPr>
+              <w:spacing w:before="0" w:after="0" w:line="276" w:lineRule="auto"/>
+            </w:pPr>
+            <w:r>
+              <w:rPr>
+                <w:rFonts w:ascii="Calibri" w:hAnsi="Calibri"/>
+                <w:b/>
+                <w:color w:val="1E293B"/>
+                <w:sz w:val="19"/>
+              </w:rPr>
+              <w:t>RF-015</w:t>
+            </w:r>
+          </w:p>
+        </w:tc>
+        <w:tc>
+          <w:tcPr>
+            <w:tcW w:type="dxa" w:w="1170"/>
+            <w:vAlign w:val="center"/>
+            <w:tcMar>
+              <w:top w:w="120" w:type="dxa"/>
+              <w:bottom w:w="120" w:type="dxa"/>
+              <w:left w:w="150" w:type="dxa"/>
+              <w:right w:w="150" w:type="dxa"/>
+            </w:tcMar>
+            <w:shd w:fill="F8FAFC"/>
+          </w:tcPr>
+          <w:p>
+            <w:pPr>
+              <w:spacing w:before="0" w:after="0" w:line="276" w:lineRule="auto"/>
+            </w:pPr>
+            <w:r>
+              <w:rPr>
+                <w:rFonts w:ascii="Calibri" w:hAnsi="Calibri"/>
+                <w:color w:val="1E293B"/>
+                <w:sz w:val="19"/>
+              </w:rPr>
+              <w:t>Identificación DNI/RUC y Referencias</w:t>
+            </w:r>
+          </w:p>
+        </w:tc>
+        <w:tc>
+          <w:tcPr>
+            <w:tcW w:type="dxa" w:w="1170"/>
+            <w:vAlign w:val="center"/>
+            <w:tcMar>
+              <w:top w:w="120" w:type="dxa"/>
+              <w:bottom w:w="120" w:type="dxa"/>
+              <w:left w:w="150" w:type="dxa"/>
+              <w:right w:w="150" w:type="dxa"/>
+            </w:tcMar>
+            <w:shd w:fill="F8FAFC"/>
+          </w:tcPr>
+          <w:p>
+            <w:pPr>
+              <w:spacing w:before="0" w:after="0" w:line="276" w:lineRule="auto"/>
+            </w:pPr>
+            <w:r>
+              <w:rPr>
+                <w:rFonts w:ascii="Calibri" w:hAnsi="Calibri"/>
+                <w:color w:val="1E293B"/>
+                <w:sz w:val="19"/>
+              </w:rPr>
+              <w:t>Cliente / Admin</w:t>
+            </w:r>
+          </w:p>
+        </w:tc>
+        <w:tc>
+          <w:tcPr>
+            <w:tcW w:type="dxa" w:w="1170"/>
+            <w:vAlign w:val="center"/>
+            <w:tcMar>
+              <w:top w:w="120" w:type="dxa"/>
+              <w:bottom w:w="120" w:type="dxa"/>
+              <w:left w:w="150" w:type="dxa"/>
+              <w:right w:w="150" w:type="dxa"/>
+            </w:tcMar>
+            <w:shd w:fill="F8FAFC"/>
+          </w:tcPr>
+          <w:p>
+            <w:pPr>
+              <w:spacing w:before="0" w:after="0" w:line="276" w:lineRule="auto"/>
+            </w:pPr>
+            <w:r>
+              <w:rPr>
+                <w:rFonts w:ascii="Calibri" w:hAnsi="Calibri"/>
+                <w:color w:val="1E293B"/>
+                <w:sz w:val="19"/>
+              </w:rPr>
+              <w:t>El sistema debe capturar el DNI o RUC del cliente, exigiéndolo obligatoriamente para envíos nacionales por encomienda, además del distrito y referencia física.</w:t>
+            </w:r>
+          </w:p>
+        </w:tc>
+        <w:tc>
+          <w:tcPr>
+            <w:tcW w:type="dxa" w:w="1170"/>
+            <w:vAlign w:val="center"/>
+            <w:tcMar>
+              <w:top w:w="120" w:type="dxa"/>
+              <w:bottom w:w="120" w:type="dxa"/>
+              <w:left w:w="150" w:type="dxa"/>
+              <w:right w:w="150" w:type="dxa"/>
+            </w:tcMar>
+            <w:shd w:fill="F8FAFC"/>
+          </w:tcPr>
+          <w:p>
+            <w:pPr>
+              <w:spacing w:before="0" w:after="0" w:line="276" w:lineRule="auto"/>
+            </w:pPr>
+            <w:r>
+              <w:rPr>
+                <w:rFonts w:ascii="Calibri" w:hAnsi="Calibri"/>
+                <w:color w:val="1E293B"/>
+                <w:sz w:val="19"/>
+              </w:rPr>
+              <w:t>Alta</w:t>
+            </w:r>
+          </w:p>
+        </w:tc>
+        <w:tc>
+          <w:tcPr>
+            <w:tcW w:type="dxa" w:w="1170"/>
+            <w:vAlign w:val="center"/>
+            <w:tcMar>
+              <w:top w:w="120" w:type="dxa"/>
+              <w:bottom w:w="120" w:type="dxa"/>
+              <w:left w:w="150" w:type="dxa"/>
+              <w:right w:w="150" w:type="dxa"/>
+            </w:tcMar>
+            <w:shd w:fill="F8FAFC"/>
+          </w:tcPr>
+          <w:p>
+            <w:pPr>
+              <w:spacing w:before="0" w:after="0" w:line="276" w:lineRule="auto"/>
+            </w:pPr>
+            <w:r>
+              <w:rPr>
+                <w:rFonts w:ascii="Calibri" w:hAnsi="Calibri"/>
+                <w:color w:val="1E293B"/>
+                <w:sz w:val="19"/>
+              </w:rPr>
+              <w:t>Validación de formato numérico de documento (8 o 11 dígitos) y bloqueo de despacho interprovincial si no se provee.</w:t>
+            </w:r>
+          </w:p>
+        </w:tc>
+        <w:tc>
+          <w:tcPr>
+            <w:tcW w:type="dxa" w:w="1170"/>
+            <w:vAlign w:val="center"/>
+            <w:tcMar>
+              <w:top w:w="120" w:type="dxa"/>
+              <w:bottom w:w="120" w:type="dxa"/>
+              <w:left w:w="150" w:type="dxa"/>
+              <w:right w:w="150" w:type="dxa"/>
+            </w:tcMar>
+            <w:shd w:fill="F8FAFC"/>
+          </w:tcPr>
+          <w:p>
+            <w:pPr>
+              <w:spacing w:before="0" w:after="0" w:line="276" w:lineRule="auto"/>
+            </w:pPr>
+            <w:r>
+              <w:rPr>
+                <w:rFonts w:ascii="Calibri" w:hAnsi="Calibri"/>
+                <w:color w:val="1E293B"/>
+                <w:sz w:val="19"/>
+              </w:rPr>
+              <w:t>Pedidos</w:t>
+            </w:r>
+          </w:p>
+        </w:tc>
+        <w:tc>
+          <w:tcPr>
+            <w:tcW w:type="dxa" w:w="1170"/>
+            <w:vAlign w:val="center"/>
+            <w:tcMar>
+              <w:top w:w="120" w:type="dxa"/>
+              <w:bottom w:w="120" w:type="dxa"/>
+              <w:left w:w="150" w:type="dxa"/>
+              <w:right w:w="150" w:type="dxa"/>
+            </w:tcMar>
+            <w:shd w:fill="F8FAFC"/>
+          </w:tcPr>
+          <w:p>
+            <w:pPr>
+              <w:spacing w:before="0" w:after="0" w:line="276" w:lineRule="auto"/>
+            </w:pPr>
+            <w:r>
+              <w:rPr>
+                <w:rFonts w:ascii="Calibri" w:hAnsi="Calibri"/>
+                <w:color w:val="1E293B"/>
+                <w:sz w:val="19"/>
+              </w:rPr>
+              <w:t>Implementado</w:t>
+            </w:r>
+          </w:p>
+        </w:tc>
+      </w:tr>
+      <w:tr>
+        <w:trPr>
+          <w:trHeight w:val="280"/>
+        </w:trPr>
+        <w:tc>
+          <w:tcPr>
+            <w:tcW w:type="dxa" w:w="1170"/>
+            <w:vAlign w:val="center"/>
+            <w:tcMar>
+              <w:top w:w="120" w:type="dxa"/>
+              <w:bottom w:w="120" w:type="dxa"/>
+              <w:left w:w="150" w:type="dxa"/>
+              <w:right w:w="150" w:type="dxa"/>
+            </w:tcMar>
+          </w:tcPr>
+          <w:p>
+            <w:pPr>
+              <w:spacing w:before="0" w:after="0" w:line="276" w:lineRule="auto"/>
+            </w:pPr>
+            <w:r>
+              <w:rPr>
+                <w:rFonts w:ascii="Calibri" w:hAnsi="Calibri"/>
+                <w:b/>
+                <w:color w:val="1E293B"/>
+                <w:sz w:val="19"/>
+              </w:rPr>
+              <w:t>RF-016</w:t>
+            </w:r>
+          </w:p>
+        </w:tc>
+        <w:tc>
+          <w:tcPr>
+            <w:tcW w:type="dxa" w:w="1170"/>
+            <w:vAlign w:val="center"/>
+            <w:tcMar>
+              <w:top w:w="120" w:type="dxa"/>
+              <w:bottom w:w="120" w:type="dxa"/>
+              <w:left w:w="150" w:type="dxa"/>
+              <w:right w:w="150" w:type="dxa"/>
+            </w:tcMar>
+          </w:tcPr>
+          <w:p>
+            <w:pPr>
+              <w:spacing w:before="0" w:after="0" w:line="276" w:lineRule="auto"/>
+            </w:pPr>
+            <w:r>
+              <w:rPr>
+                <w:rFonts w:ascii="Calibri" w:hAnsi="Calibri"/>
+                <w:color w:val="1E293B"/>
+                <w:sz w:val="19"/>
+              </w:rPr>
+              <w:t>Métodos de Pago y Cupones Promocionales</w:t>
+            </w:r>
+          </w:p>
+        </w:tc>
+        <w:tc>
+          <w:tcPr>
+            <w:tcW w:type="dxa" w:w="1170"/>
+            <w:vAlign w:val="center"/>
+            <w:tcMar>
+              <w:top w:w="120" w:type="dxa"/>
+              <w:bottom w:w="120" w:type="dxa"/>
+              <w:left w:w="150" w:type="dxa"/>
+              <w:right w:w="150" w:type="dxa"/>
+            </w:tcMar>
+          </w:tcPr>
+          <w:p>
+            <w:pPr>
+              <w:spacing w:before="0" w:after="0" w:line="276" w:lineRule="auto"/>
+            </w:pPr>
+            <w:r>
+              <w:rPr>
+                <w:rFonts w:ascii="Calibri" w:hAnsi="Calibri"/>
+                <w:color w:val="1E293B"/>
+                <w:sz w:val="19"/>
+              </w:rPr>
+              <w:t>Cliente / Admin</w:t>
+            </w:r>
+          </w:p>
+        </w:tc>
+        <w:tc>
+          <w:tcPr>
+            <w:tcW w:type="dxa" w:w="1170"/>
+            <w:vAlign w:val="center"/>
+            <w:tcMar>
+              <w:top w:w="120" w:type="dxa"/>
+              <w:bottom w:w="120" w:type="dxa"/>
+              <w:left w:w="150" w:type="dxa"/>
+              <w:right w:w="150" w:type="dxa"/>
+            </w:tcMar>
+          </w:tcPr>
+          <w:p>
+            <w:pPr>
+              <w:spacing w:before="0" w:after="0" w:line="276" w:lineRule="auto"/>
+            </w:pPr>
+            <w:r>
+              <w:rPr>
+                <w:rFonts w:ascii="Calibri" w:hAnsi="Calibri"/>
+                <w:color w:val="1E293B"/>
+                <w:sz w:val="19"/>
+              </w:rPr>
+              <w:t>El sistema debe soportar registro de medios de pago locales (Yape, Plin, BCP, BBVA, Contra Entrega, Tarjeta), captura de N° de Operación y aplicación de cupones de descuento.</w:t>
+            </w:r>
+          </w:p>
+        </w:tc>
+        <w:tc>
+          <w:tcPr>
+            <w:tcW w:type="dxa" w:w="1170"/>
+            <w:vAlign w:val="center"/>
+            <w:tcMar>
+              <w:top w:w="120" w:type="dxa"/>
+              <w:bottom w:w="120" w:type="dxa"/>
+              <w:left w:w="150" w:type="dxa"/>
+              <w:right w:w="150" w:type="dxa"/>
+            </w:tcMar>
+          </w:tcPr>
+          <w:p>
+            <w:pPr>
+              <w:spacing w:before="0" w:after="0" w:line="276" w:lineRule="auto"/>
+            </w:pPr>
+            <w:r>
+              <w:rPr>
+                <w:rFonts w:ascii="Calibri" w:hAnsi="Calibri"/>
+                <w:color w:val="1E293B"/>
+                <w:sz w:val="19"/>
+              </w:rPr>
+              <w:t>Alta</w:t>
+            </w:r>
+          </w:p>
+        </w:tc>
+        <w:tc>
+          <w:tcPr>
+            <w:tcW w:type="dxa" w:w="1170"/>
+            <w:vAlign w:val="center"/>
+            <w:tcMar>
+              <w:top w:w="120" w:type="dxa"/>
+              <w:bottom w:w="120" w:type="dxa"/>
+              <w:left w:w="150" w:type="dxa"/>
+              <w:right w:w="150" w:type="dxa"/>
+            </w:tcMar>
+          </w:tcPr>
+          <w:p>
+            <w:pPr>
+              <w:spacing w:before="0" w:after="0" w:line="276" w:lineRule="auto"/>
+            </w:pPr>
+            <w:r>
+              <w:rPr>
+                <w:rFonts w:ascii="Calibri" w:hAnsi="Calibri"/>
+                <w:color w:val="1E293B"/>
+                <w:sz w:val="19"/>
+              </w:rPr>
+              <w:t>Validación de cupones en tiempo real (</w:t>
+            </w:r>
+            <w:r>
+              <w:rPr>
+                <w:rFonts w:ascii="Consolas" w:hAnsi="Consolas"/>
+                <w:color w:val="C2410C"/>
+                <w:sz w:val="19"/>
+              </w:rPr>
+              <w:t>LEOFIT10</w:t>
+            </w:r>
+            <w:r>
+              <w:rPr>
+                <w:rFonts w:ascii="Calibri" w:hAnsi="Calibri"/>
+                <w:color w:val="1E293B"/>
+                <w:sz w:val="19"/>
+              </w:rPr>
+              <w:t xml:space="preserve">, </w:t>
+            </w:r>
+            <w:r>
+              <w:rPr>
+                <w:rFonts w:ascii="Consolas" w:hAnsi="Consolas"/>
+                <w:color w:val="C2410C"/>
+                <w:sz w:val="19"/>
+              </w:rPr>
+              <w:t>PROMOVERANO</w:t>
+            </w:r>
+            <w:r>
+              <w:rPr>
+                <w:rFonts w:ascii="Calibri" w:hAnsi="Calibri"/>
+                <w:color w:val="1E293B"/>
+                <w:sz w:val="19"/>
+              </w:rPr>
+              <w:t xml:space="preserve">, </w:t>
+            </w:r>
+            <w:r>
+              <w:rPr>
+                <w:rFonts w:ascii="Consolas" w:hAnsi="Consolas"/>
+                <w:color w:val="C2410C"/>
+                <w:sz w:val="19"/>
+              </w:rPr>
+              <w:t>ENVIOGRATIS</w:t>
+            </w:r>
+            <w:r>
+              <w:rPr>
+                <w:rFonts w:ascii="Calibri" w:hAnsi="Calibri"/>
+                <w:color w:val="1E293B"/>
+                <w:sz w:val="19"/>
+              </w:rPr>
+              <w:t>) con recálculo dinámico de la liquidación.</w:t>
+            </w:r>
+          </w:p>
+        </w:tc>
+        <w:tc>
+          <w:tcPr>
+            <w:tcW w:type="dxa" w:w="1170"/>
+            <w:vAlign w:val="center"/>
+            <w:tcMar>
+              <w:top w:w="120" w:type="dxa"/>
+              <w:bottom w:w="120" w:type="dxa"/>
+              <w:left w:w="150" w:type="dxa"/>
+              <w:right w:w="150" w:type="dxa"/>
+            </w:tcMar>
+          </w:tcPr>
+          <w:p>
+            <w:pPr>
+              <w:spacing w:before="0" w:after="0" w:line="276" w:lineRule="auto"/>
+            </w:pPr>
+            <w:r>
+              <w:rPr>
+                <w:rFonts w:ascii="Calibri" w:hAnsi="Calibri"/>
+                <w:color w:val="1E293B"/>
+                <w:sz w:val="19"/>
+              </w:rPr>
+              <w:t>Facturación</w:t>
+            </w:r>
+          </w:p>
+        </w:tc>
+        <w:tc>
+          <w:tcPr>
+            <w:tcW w:type="dxa" w:w="1170"/>
+            <w:vAlign w:val="center"/>
+            <w:tcMar>
+              <w:top w:w="120" w:type="dxa"/>
+              <w:bottom w:w="120" w:type="dxa"/>
+              <w:left w:w="150" w:type="dxa"/>
+              <w:right w:w="150" w:type="dxa"/>
+            </w:tcMar>
+          </w:tcPr>
+          <w:p>
+            <w:pPr>
+              <w:spacing w:before="0" w:after="0" w:line="276" w:lineRule="auto"/>
+            </w:pPr>
+            <w:r>
+              <w:rPr>
+                <w:rFonts w:ascii="Calibri" w:hAnsi="Calibri"/>
+                <w:color w:val="1E293B"/>
+                <w:sz w:val="19"/>
+              </w:rPr>
+              <w:t>Implementado</w:t>
+            </w:r>
+          </w:p>
+        </w:tc>
+      </w:tr>
+      <w:tr>
+        <w:trPr>
+          <w:trHeight w:val="280"/>
+        </w:trPr>
+        <w:tc>
+          <w:tcPr>
+            <w:tcW w:type="dxa" w:w="1170"/>
+            <w:vAlign w:val="center"/>
+            <w:tcMar>
+              <w:top w:w="120" w:type="dxa"/>
+              <w:bottom w:w="120" w:type="dxa"/>
+              <w:left w:w="150" w:type="dxa"/>
+              <w:right w:w="150" w:type="dxa"/>
+            </w:tcMar>
+            <w:shd w:fill="F8FAFC"/>
+          </w:tcPr>
+          <w:p>
+            <w:pPr>
+              <w:spacing w:before="0" w:after="0" w:line="276" w:lineRule="auto"/>
+            </w:pPr>
+            <w:r>
+              <w:rPr>
+                <w:rFonts w:ascii="Calibri" w:hAnsi="Calibri"/>
+                <w:b/>
+                <w:color w:val="1E293B"/>
+                <w:sz w:val="19"/>
+              </w:rPr>
+              <w:t>RF-017</w:t>
+            </w:r>
+          </w:p>
+        </w:tc>
+        <w:tc>
+          <w:tcPr>
+            <w:tcW w:type="dxa" w:w="1170"/>
+            <w:vAlign w:val="center"/>
+            <w:tcMar>
+              <w:top w:w="120" w:type="dxa"/>
+              <w:bottom w:w="120" w:type="dxa"/>
+              <w:left w:w="150" w:type="dxa"/>
+              <w:right w:w="150" w:type="dxa"/>
+            </w:tcMar>
+            <w:shd w:fill="F8FAFC"/>
+          </w:tcPr>
+          <w:p>
+            <w:pPr>
+              <w:spacing w:before="0" w:after="0" w:line="276" w:lineRule="auto"/>
+            </w:pPr>
+            <w:r>
+              <w:rPr>
+                <w:rFonts w:ascii="Calibri" w:hAnsi="Calibri"/>
+                <w:color w:val="1E293B"/>
+                <w:sz w:val="19"/>
+              </w:rPr>
+              <w:t>Urgencia de Inventario y Garantías</w:t>
+            </w:r>
+          </w:p>
+        </w:tc>
+        <w:tc>
+          <w:tcPr>
+            <w:tcW w:type="dxa" w:w="1170"/>
+            <w:vAlign w:val="center"/>
+            <w:tcMar>
+              <w:top w:w="120" w:type="dxa"/>
+              <w:bottom w:w="120" w:type="dxa"/>
+              <w:left w:w="150" w:type="dxa"/>
+              <w:right w:w="150" w:type="dxa"/>
+            </w:tcMar>
+            <w:shd w:fill="F8FAFC"/>
+          </w:tcPr>
+          <w:p>
+            <w:pPr>
+              <w:spacing w:before="0" w:after="0" w:line="276" w:lineRule="auto"/>
+            </w:pPr>
+            <w:r>
+              <w:rPr>
+                <w:rFonts w:ascii="Calibri" w:hAnsi="Calibri"/>
+                <w:color w:val="1E293B"/>
+                <w:sz w:val="19"/>
+              </w:rPr>
+              <w:t>Cliente / Admin</w:t>
+            </w:r>
+          </w:p>
+        </w:tc>
+        <w:tc>
+          <w:tcPr>
+            <w:tcW w:type="dxa" w:w="1170"/>
+            <w:vAlign w:val="center"/>
+            <w:tcMar>
+              <w:top w:w="120" w:type="dxa"/>
+              <w:bottom w:w="120" w:type="dxa"/>
+              <w:left w:w="150" w:type="dxa"/>
+              <w:right w:w="150" w:type="dxa"/>
+            </w:tcMar>
+            <w:shd w:fill="F8FAFC"/>
+          </w:tcPr>
+          <w:p>
+            <w:pPr>
+              <w:spacing w:before="0" w:after="0" w:line="276" w:lineRule="auto"/>
+            </w:pPr>
+            <w:r>
+              <w:rPr>
+                <w:rFonts w:ascii="Calibri" w:hAnsi="Calibri"/>
+                <w:color w:val="1E293B"/>
+                <w:sz w:val="19"/>
+              </w:rPr>
+              <w:t>El sistema debe desplegar insignias de stock crítico (</w:t>
+            </w:r>
+            <w:r>
+              <w:rPr>
+                <w:rFonts w:ascii="Calibri" w:hAnsi="Calibri"/>
+                <w:i/>
+                <w:color w:val="1E293B"/>
+                <w:sz w:val="19"/>
+              </w:rPr>
+              <w:t>≤ 5</w:t>
+            </w:r>
+            <w:r>
+              <w:rPr>
+                <w:rFonts w:ascii="Calibri" w:hAnsi="Calibri"/>
+                <w:color w:val="1E293B"/>
+                <w:sz w:val="19"/>
+              </w:rPr>
+              <w:t xml:space="preserve"> unidades) en prendas seleccionadas e incluir la cláusula de garantía de satisfacción y cambio de talla.</w:t>
+            </w:r>
+          </w:p>
+        </w:tc>
+        <w:tc>
+          <w:tcPr>
+            <w:tcW w:type="dxa" w:w="1170"/>
+            <w:vAlign w:val="center"/>
+            <w:tcMar>
+              <w:top w:w="120" w:type="dxa"/>
+              <w:bottom w:w="120" w:type="dxa"/>
+              <w:left w:w="150" w:type="dxa"/>
+              <w:right w:w="150" w:type="dxa"/>
+            </w:tcMar>
+            <w:shd w:fill="F8FAFC"/>
+          </w:tcPr>
+          <w:p>
+            <w:pPr>
+              <w:spacing w:before="0" w:after="0" w:line="276" w:lineRule="auto"/>
+            </w:pPr>
+            <w:r>
+              <w:rPr>
+                <w:rFonts w:ascii="Calibri" w:hAnsi="Calibri"/>
+                <w:color w:val="1E293B"/>
+                <w:sz w:val="19"/>
+              </w:rPr>
+              <w:t>Media</w:t>
+            </w:r>
+          </w:p>
+        </w:tc>
+        <w:tc>
+          <w:tcPr>
+            <w:tcW w:type="dxa" w:w="1170"/>
+            <w:vAlign w:val="center"/>
+            <w:tcMar>
+              <w:top w:w="120" w:type="dxa"/>
+              <w:bottom w:w="120" w:type="dxa"/>
+              <w:left w:w="150" w:type="dxa"/>
+              <w:right w:w="150" w:type="dxa"/>
+            </w:tcMar>
+            <w:shd w:fill="F8FAFC"/>
+          </w:tcPr>
+          <w:p>
+            <w:pPr>
+              <w:spacing w:before="0" w:after="0" w:line="276" w:lineRule="auto"/>
+            </w:pPr>
+            <w:r>
+              <w:rPr>
+                <w:rFonts w:ascii="Calibri" w:hAnsi="Calibri"/>
+                <w:color w:val="1E293B"/>
+                <w:sz w:val="19"/>
+              </w:rPr>
+              <w:t>Alerta visual en el selector de prendas y presentación de la tarjeta de Garantía Oficial LeoFit en orden y rastreo.</w:t>
+            </w:r>
+          </w:p>
+        </w:tc>
+        <w:tc>
+          <w:tcPr>
+            <w:tcW w:type="dxa" w:w="1170"/>
+            <w:vAlign w:val="center"/>
+            <w:tcMar>
+              <w:top w:w="120" w:type="dxa"/>
+              <w:bottom w:w="120" w:type="dxa"/>
+              <w:left w:w="150" w:type="dxa"/>
+              <w:right w:w="150" w:type="dxa"/>
+            </w:tcMar>
+            <w:shd w:fill="F8FAFC"/>
+          </w:tcPr>
+          <w:p>
+            <w:pPr>
+              <w:spacing w:before="0" w:after="0" w:line="276" w:lineRule="auto"/>
+            </w:pPr>
+            <w:r>
+              <w:rPr>
+                <w:rFonts w:ascii="Calibri" w:hAnsi="Calibri"/>
+                <w:color w:val="1E293B"/>
+                <w:sz w:val="19"/>
+              </w:rPr>
+              <w:t>Catálogo / UX</w:t>
+            </w:r>
+          </w:p>
+        </w:tc>
+        <w:tc>
+          <w:tcPr>
+            <w:tcW w:type="dxa" w:w="1170"/>
+            <w:vAlign w:val="center"/>
+            <w:tcMar>
+              <w:top w:w="120" w:type="dxa"/>
+              <w:bottom w:w="120" w:type="dxa"/>
+              <w:left w:w="150" w:type="dxa"/>
+              <w:right w:w="150" w:type="dxa"/>
+            </w:tcMar>
+            <w:shd w:fill="F8FAFC"/>
           </w:tcPr>
           <w:p>
             <w:pPr>
@@ -5865,7 +6564,7 @@
                 <w:color w:val="1E293B"/>
                 <w:sz w:val="19"/>
               </w:rPr>
-              <w:t>Las opciones de edición y cifras monetarias pueden ocultarse con un clic.</w:t>
+              <w:t>Las opciones de edición y cifras monetarias pueden ocultarse de forma granular.</w:t>
             </w:r>
           </w:p>
         </w:tc>
@@ -5890,7 +6589,7 @@
                 <w:color w:val="1E293B"/>
                 <w:sz w:val="19"/>
               </w:rPr>
-              <w:t>Denegación inmediata de acceso sin sesión y modo privacidad activable.</w:t>
+              <w:t>Denegación inmediata de acceso sin sesión y toggles de privacidad por métrica.</w:t>
             </w:r>
           </w:p>
         </w:tc>
@@ -6613,7 +7312,7 @@
                 <w:color w:val="1E293B"/>
                 <w:sz w:val="19"/>
               </w:rPr>
-              <w:t>RF-001, RF-002</w:t>
+              <w:t>RF-001, RF-002, RF-017</w:t>
             </w:r>
           </w:p>
         </w:tc>
@@ -6639,7 +7338,7 @@
                 <w:color w:val="1E293B"/>
                 <w:sz w:val="19"/>
               </w:rPr>
-              <w:t>HU-001 (Filtrado de Catálogo)</w:t>
+              <w:t>HU-001 (Filtrado de Catálogo e Inventario)</w:t>
             </w:r>
           </w:p>
         </w:tc>
@@ -6747,7 +7446,7 @@
                 <w:color w:val="1E293B"/>
                 <w:sz w:val="19"/>
               </w:rPr>
-              <w:t>HU-002 (Carrito de Compras)</w:t>
+              <w:t>HU-002 (Carrito de Compras Reactivo)</w:t>
             </w:r>
           </w:p>
         </w:tc>
@@ -6829,7 +7528,7 @@
                 <w:color w:val="1E293B"/>
                 <w:sz w:val="19"/>
               </w:rPr>
-              <w:t>RF-005, RF-006, RF-011, RF-013</w:t>
+              <w:t>RF-005, RF-006, RF-011, RF-013, RF-015, RF-016</w:t>
             </w:r>
           </w:p>
         </w:tc>
@@ -6855,7 +7554,7 @@
                 <w:color w:val="1E293B"/>
                 <w:sz w:val="19"/>
               </w:rPr>
-              <w:t>HU-003 (Registro y Despacho de Pedidos)</w:t>
+              <w:t>HU-003 (Registro, DNI, Pago y Despacho de Pedidos)</w:t>
             </w:r>
           </w:p>
         </w:tc>
@@ -6938,7 +7637,7 @@
                 <w:color w:val="1E293B"/>
                 <w:sz w:val="19"/>
               </w:rPr>
-              <w:t>RF-007, RF-008, RF-013</w:t>
+              <w:t>RF-007, RF-008, RF-013, RF-015, RF-016</w:t>
             </w:r>
           </w:p>
         </w:tc>
@@ -6963,7 +7662,7 @@
                 <w:color w:val="1E293B"/>
                 <w:sz w:val="19"/>
               </w:rPr>
-              <w:t>HU-004 (Control de Estados y Encomiendas)</w:t>
+              <w:t>HU-004 (Control de Estados, Pagos y Encomiendas)</w:t>
             </w:r>
           </w:p>
         </w:tc>
@@ -7045,7 +7744,7 @@
                 <w:color w:val="1E293B"/>
                 <w:sz w:val="19"/>
               </w:rPr>
-              <w:t>RF-009</w:t>
+              <w:t>RF-009, RF-017</w:t>
             </w:r>
           </w:p>
         </w:tc>
@@ -7071,7 +7770,7 @@
                 <w:color w:val="1E293B"/>
                 <w:sz w:val="19"/>
               </w:rPr>
-              <w:t>HU-006 (Gestión de Inventario)</w:t>
+              <w:t>HU-006 (Gestión de Inventario y Stock Crítico)</w:t>
             </w:r>
           </w:p>
         </w:tc>
@@ -7179,7 +7878,7 @@
                 <w:color w:val="1E293B"/>
                 <w:sz w:val="19"/>
               </w:rPr>
-              <w:t>HU-005 (Métricas de Dashboard)</w:t>
+              <w:t>HU-005 (Métricas de Dashboard con Privacidad)</w:t>
             </w:r>
           </w:p>
         </w:tc>
@@ -7287,7 +7986,7 @@
                 <w:color w:val="1E293B"/>
                 <w:sz w:val="19"/>
               </w:rPr>
-              <w:t>HU-007 (Seguridad y Acceso)</w:t>
+              <w:t>HU-007 (Seguridad y Acceso Administrativo)</w:t>
             </w:r>
           </w:p>
         </w:tc>
@@ -7370,7 +8069,7 @@
                 <w:color w:val="1E293B"/>
                 <w:sz w:val="19"/>
               </w:rPr>
-              <w:t>RF-014</w:t>
+              <w:t>RF-014, RF-015, RF-017</w:t>
             </w:r>
           </w:p>
         </w:tc>
@@ -7395,7 +8094,7 @@
                 <w:color w:val="1E293B"/>
                 <w:sz w:val="19"/>
               </w:rPr>
-              <w:t>HU-008 (Portal de Rastreo en Vivo)</w:t>
+              <w:t>HU-008 (Portal de Rastreo en Vivo con DNI y Garantías)</w:t>
             </w:r>
           </w:p>
         </w:tc>

</xml_diff>

<commit_message>
feat(receipts): add digital PDF receipt & shipping label generator, whatsapp dispatch and RF-018 requirement
</commit_message>
<xml_diff>
--- a/docs/02_Requerimientos.docx
+++ b/docs/02_Requerimientos.docx
@@ -4581,6 +4581,228 @@
           </w:p>
         </w:tc>
       </w:tr>
+      <w:tr>
+        <w:trPr>
+          <w:trHeight w:val="280"/>
+        </w:trPr>
+        <w:tc>
+          <w:tcPr>
+            <w:tcW w:type="dxa" w:w="1170"/>
+            <w:vAlign w:val="center"/>
+            <w:tcMar>
+              <w:top w:w="120" w:type="dxa"/>
+              <w:bottom w:w="120" w:type="dxa"/>
+              <w:left w:w="150" w:type="dxa"/>
+              <w:right w:w="150" w:type="dxa"/>
+            </w:tcMar>
+          </w:tcPr>
+          <w:p>
+            <w:pPr>
+              <w:spacing w:before="0" w:after="0" w:line="276" w:lineRule="auto"/>
+            </w:pPr>
+            <w:r>
+              <w:rPr>
+                <w:rFonts w:ascii="Calibri" w:hAnsi="Calibri"/>
+                <w:b/>
+                <w:color w:val="1E293B"/>
+                <w:sz w:val="19"/>
+              </w:rPr>
+              <w:t>RF-018</w:t>
+            </w:r>
+          </w:p>
+        </w:tc>
+        <w:tc>
+          <w:tcPr>
+            <w:tcW w:type="dxa" w:w="1170"/>
+            <w:vAlign w:val="center"/>
+            <w:tcMar>
+              <w:top w:w="120" w:type="dxa"/>
+              <w:bottom w:w="120" w:type="dxa"/>
+              <w:left w:w="150" w:type="dxa"/>
+              <w:right w:w="150" w:type="dxa"/>
+            </w:tcMar>
+          </w:tcPr>
+          <w:p>
+            <w:pPr>
+              <w:spacing w:before="0" w:after="0" w:line="276" w:lineRule="auto"/>
+            </w:pPr>
+            <w:r>
+              <w:rPr>
+                <w:rFonts w:ascii="Calibri" w:hAnsi="Calibri"/>
+                <w:color w:val="1E293B"/>
+                <w:sz w:val="19"/>
+              </w:rPr>
+              <w:t>Emisión de Recibos PDF y Rótulos</w:t>
+            </w:r>
+          </w:p>
+        </w:tc>
+        <w:tc>
+          <w:tcPr>
+            <w:tcW w:type="dxa" w:w="1170"/>
+            <w:vAlign w:val="center"/>
+            <w:tcMar>
+              <w:top w:w="120" w:type="dxa"/>
+              <w:bottom w:w="120" w:type="dxa"/>
+              <w:left w:w="150" w:type="dxa"/>
+              <w:right w:w="150" w:type="dxa"/>
+            </w:tcMar>
+          </w:tcPr>
+          <w:p>
+            <w:pPr>
+              <w:spacing w:before="0" w:after="0" w:line="276" w:lineRule="auto"/>
+            </w:pPr>
+            <w:r>
+              <w:rPr>
+                <w:rFonts w:ascii="Calibri" w:hAnsi="Calibri"/>
+                <w:color w:val="1E293B"/>
+                <w:sz w:val="19"/>
+              </w:rPr>
+              <w:t>Cliente / Admin</w:t>
+            </w:r>
+          </w:p>
+        </w:tc>
+        <w:tc>
+          <w:tcPr>
+            <w:tcW w:type="dxa" w:w="1170"/>
+            <w:vAlign w:val="center"/>
+            <w:tcMar>
+              <w:top w:w="120" w:type="dxa"/>
+              <w:bottom w:w="120" w:type="dxa"/>
+              <w:left w:w="150" w:type="dxa"/>
+              <w:right w:w="150" w:type="dxa"/>
+            </w:tcMar>
+          </w:tcPr>
+          <w:p>
+            <w:pPr>
+              <w:spacing w:before="0" w:after="0" w:line="276" w:lineRule="auto"/>
+            </w:pPr>
+            <w:r>
+              <w:rPr>
+                <w:rFonts w:ascii="Calibri" w:hAnsi="Calibri"/>
+                <w:color w:val="1E293B"/>
+                <w:sz w:val="19"/>
+              </w:rPr>
+              <w:t>El sistema debe generar recibos digitales oficiales en PDF y rótulos de despacho adhesivos para agencias de encomienda (Shalom / Olva), con opción de impresión y envío directo por WhatsApp.</w:t>
+            </w:r>
+          </w:p>
+        </w:tc>
+        <w:tc>
+          <w:tcPr>
+            <w:tcW w:type="dxa" w:w="1170"/>
+            <w:vAlign w:val="center"/>
+            <w:tcMar>
+              <w:top w:w="120" w:type="dxa"/>
+              <w:bottom w:w="120" w:type="dxa"/>
+              <w:left w:w="150" w:type="dxa"/>
+              <w:right w:w="150" w:type="dxa"/>
+            </w:tcMar>
+          </w:tcPr>
+          <w:p>
+            <w:pPr>
+              <w:spacing w:before="0" w:after="0" w:line="276" w:lineRule="auto"/>
+            </w:pPr>
+            <w:r>
+              <w:rPr>
+                <w:rFonts w:ascii="Calibri" w:hAnsi="Calibri"/>
+                <w:color w:val="1E293B"/>
+                <w:sz w:val="19"/>
+              </w:rPr>
+              <w:t>Alta</w:t>
+            </w:r>
+          </w:p>
+        </w:tc>
+        <w:tc>
+          <w:tcPr>
+            <w:tcW w:type="dxa" w:w="1170"/>
+            <w:vAlign w:val="center"/>
+            <w:tcMar>
+              <w:top w:w="120" w:type="dxa"/>
+              <w:bottom w:w="120" w:type="dxa"/>
+              <w:left w:w="150" w:type="dxa"/>
+              <w:right w:w="150" w:type="dxa"/>
+            </w:tcMar>
+          </w:tcPr>
+          <w:p>
+            <w:pPr>
+              <w:spacing w:before="0" w:after="0" w:line="276" w:lineRule="auto"/>
+            </w:pPr>
+            <w:r>
+              <w:rPr>
+                <w:rFonts w:ascii="Calibri" w:hAnsi="Calibri"/>
+                <w:color w:val="1E293B"/>
+                <w:sz w:val="19"/>
+              </w:rPr>
+              <w:t xml:space="preserve">Modal interactivo con selector de vista (Recibo vs Rótulo), estilos de impresión </w:t>
+            </w:r>
+            <w:r>
+              <w:rPr>
+                <w:rFonts w:ascii="Consolas" w:hAnsi="Consolas"/>
+                <w:color w:val="C2410C"/>
+                <w:sz w:val="19"/>
+              </w:rPr>
+              <w:t>@media print</w:t>
+            </w:r>
+            <w:r>
+              <w:rPr>
+                <w:rFonts w:ascii="Calibri" w:hAnsi="Calibri"/>
+                <w:color w:val="1E293B"/>
+                <w:sz w:val="19"/>
+              </w:rPr>
+              <w:t xml:space="preserve"> y enlace WhatsApp con deep-link.</w:t>
+            </w:r>
+          </w:p>
+        </w:tc>
+        <w:tc>
+          <w:tcPr>
+            <w:tcW w:type="dxa" w:w="1170"/>
+            <w:vAlign w:val="center"/>
+            <w:tcMar>
+              <w:top w:w="120" w:type="dxa"/>
+              <w:bottom w:w="120" w:type="dxa"/>
+              <w:left w:w="150" w:type="dxa"/>
+              <w:right w:w="150" w:type="dxa"/>
+            </w:tcMar>
+          </w:tcPr>
+          <w:p>
+            <w:pPr>
+              <w:spacing w:before="0" w:after="0" w:line="276" w:lineRule="auto"/>
+            </w:pPr>
+            <w:r>
+              <w:rPr>
+                <w:rFonts w:ascii="Calibri" w:hAnsi="Calibri"/>
+                <w:color w:val="1E293B"/>
+                <w:sz w:val="19"/>
+              </w:rPr>
+              <w:t>Comprobantes</w:t>
+            </w:r>
+          </w:p>
+        </w:tc>
+        <w:tc>
+          <w:tcPr>
+            <w:tcW w:type="dxa" w:w="1170"/>
+            <w:vAlign w:val="center"/>
+            <w:tcMar>
+              <w:top w:w="120" w:type="dxa"/>
+              <w:bottom w:w="120" w:type="dxa"/>
+              <w:left w:w="150" w:type="dxa"/>
+              <w:right w:w="150" w:type="dxa"/>
+            </w:tcMar>
+          </w:tcPr>
+          <w:p>
+            <w:pPr>
+              <w:spacing w:before="0" w:after="0" w:line="276" w:lineRule="auto"/>
+            </w:pPr>
+            <w:r>
+              <w:rPr>
+                <w:rFonts w:ascii="Calibri" w:hAnsi="Calibri"/>
+                <w:color w:val="1E293B"/>
+                <w:sz w:val="19"/>
+              </w:rPr>
+              <w:t>Implementado</w:t>
+            </w:r>
+          </w:p>
+        </w:tc>
+      </w:tr>
     </w:tbl>
     <w:p>
       <w:pPr>
@@ -7528,7 +7750,7 @@
                 <w:color w:val="1E293B"/>
                 <w:sz w:val="19"/>
               </w:rPr>
-              <w:t>RF-005, RF-006, RF-011, RF-013, RF-015, RF-016</w:t>
+              <w:t>RF-005, RF-006, RF-011, RF-013, RF-015, RF-016, RF-018</w:t>
             </w:r>
           </w:p>
         </w:tc>
@@ -7554,7 +7776,7 @@
                 <w:color w:val="1E293B"/>
                 <w:sz w:val="19"/>
               </w:rPr>
-              <w:t>HU-003 (Registro, DNI, Pago y Despacho de Pedidos)</w:t>
+              <w:t>HU-003 (Registro, DNI, Pago, Recibo y Despacho)</w:t>
             </w:r>
           </w:p>
         </w:tc>
@@ -7637,7 +7859,7 @@
                 <w:color w:val="1E293B"/>
                 <w:sz w:val="19"/>
               </w:rPr>
-              <w:t>RF-007, RF-008, RF-013, RF-015, RF-016</w:t>
+              <w:t>RF-007, RF-008, RF-013, RF-015, RF-016, RF-018</w:t>
             </w:r>
           </w:p>
         </w:tc>
@@ -7662,7 +7884,7 @@
                 <w:color w:val="1E293B"/>
                 <w:sz w:val="19"/>
               </w:rPr>
-              <w:t>HU-004 (Control de Estados, Pagos y Encomiendas)</w:t>
+              <w:t>HU-004 (Control de Estados, Pagos, Recibos y Rótulos)</w:t>
             </w:r>
           </w:p>
         </w:tc>
@@ -8069,7 +8291,7 @@
                 <w:color w:val="1E293B"/>
                 <w:sz w:val="19"/>
               </w:rPr>
-              <w:t>RF-014, RF-015, RF-017</w:t>
+              <w:t>RF-014, RF-015, RF-017, RF-018</w:t>
             </w:r>
           </w:p>
         </w:tc>
@@ -8094,7 +8316,7 @@
                 <w:color w:val="1E293B"/>
                 <w:sz w:val="19"/>
               </w:rPr>
-              <w:t>HU-008 (Portal de Rastreo en Vivo con DNI y Garantías)</w:t>
+              <w:t>HU-008 (Portal de Rastreo con Recibos y Garantías)</w:t>
             </w:r>
           </w:p>
         </w:tc>

</xml_diff>